<commit_message>
Release 1.4.4 with configurable invoice display and single-sheet printing
Default customer details to the shipping address only, hiding customer names,
roles, emails and other addresses. Add independent visibility controls,
safe font choices, compact spacing, bounded single-page fitting and
content-height thermal PDFs.

Use authenticated PDF previews for page-fitting modes, release renderer
memory between documents, suppress CUPS banner sheets and preserve schema
installation fixes.

Update release packaging, all 14 translation catalogs, operator documentation,
localized development guides and the companion template example.

Validation: 393 PHP tests passed on PHP 8.5 and 8.4, 23 JavaScript tests,
9 local-agent tests, all seven packaged layouts and 163 guide pages reviewed.
</commit_message>
<xml_diff>
--- a/system-development/guides/development-guide-ar.docx
+++ b/system-development/guides/development-guide-ar.docx
@@ -44,7 +44,7 @@
         <w:jc w:val="start"/>
       </w:pPr>
       <w:r>
-        <w:t>1.4.0 · 2026-10-10</w:t>
+        <w:t>1.4.4 · 2026-10-12</w:t>
       </w:r>
     </w:p>
     <w:p>
@@ -2186,7 +2186,7 @@
           <w:rtl w:val="0"/>
           <w:lang w:val="en-US" w:eastAsia="ar-SA" w:bidi="ar-SA"/>
         </w:rPr>
-        <w:t>&lt;p&gt;&lt;?php echo esc_html( $invoice-&gt;store['details'] ); ?&gt;&lt;/p&gt;</w:t>
+        <w:t>&lt;?php if ($show('show_store_details')) {</w:t>
       </w:r>
     </w:p>
     <w:p>
@@ -2204,7 +2204,7 @@
           <w:rtl w:val="0"/>
           <w:lang w:val="en-US" w:eastAsia="ar-SA" w:bidi="ar-SA"/>
         </w:rPr>
-        <w:t>&lt;bdi dir="ltr"&gt;</w:t>
+        <w:t>printf('&lt;p&gt;%s&lt;/p&gt;', esc_html($invoice-&gt;store['details'])); }</w:t>
       </w:r>
     </w:p>
     <w:p>
@@ -2222,7 +2222,7 @@
           <w:rtl w:val="0"/>
           <w:lang w:val="en-US" w:eastAsia="ar-SA" w:bidi="ar-SA"/>
         </w:rPr>
-        <w:t xml:space="preserve">  &lt;?php echo esc_html( $invoice-&gt;store['email'] ); ?&gt;</w:t>
+        <w:t>if ($show('show_store_email')) {</w:t>
       </w:r>
     </w:p>
     <w:p>
@@ -2240,7 +2240,7 @@
           <w:rtl w:val="0"/>
           <w:lang w:val="en-US" w:eastAsia="ar-SA" w:bidi="ar-SA"/>
         </w:rPr>
-        <w:t>&lt;/bdi&gt;</w:t>
+        <w:t>printf('&lt;bdi dir="ltr"&gt;%s&lt;/bdi&gt;', esc_html($invoice-&gt;store['email'])); } ?&gt;</w:t>
       </w:r>
     </w:p>
     <w:p>
@@ -9902,7 +9902,7 @@
           <w:lang w:val="ar-SA" w:bidi="ar-SA"/>
           <w:rtl w:val="0"/>
         </w:rPr>
-        <w:t>1.4.0 · 2026-10-10 · c894eb05d2120a4bba09aa3500fe2842a0e48d74</w:t>
+        <w:t>1.4.4 · 2026-10-12 · c894eb05d2120a4bba09aa3500fe2842a0e48d74</w:t>
       </w:r>
     </w:p>
     <w:p>
@@ -11071,6 +11071,167 @@
         <w:t>docs/cross-platform-printing.md · print-agent/README.md</w:t>
       </w:r>
     </w:p>
+    <w:p>
+      <w:pPr>
+        <w:pStyle w:val="Heading1"/>
+        <w:keepNext/>
+        <w:pageBreakBefore/>
+        <w:bidi w:val="1"/>
+        <w:jc w:val="start"/>
+      </w:pPr>
+      <w:pPr>
+        <w:pStyle w:val="Heading1"/>
+      </w:pPr>
+      <w:r>
+        <w:rPr>
+          <w:rFonts w:ascii="Tahoma" w:hAnsi="Tahoma" w:eastAsia="Tahoma" w:cs="Tahoma"/>
+          <w:color w:val="000000"/>
+          <w:rtl w:val="1"/>
+          <w:lang w:val="ar-SA" w:eastAsia="ar-SA" w:bidi="ar-SA"/>
+          <w:cs w:val="1"/>
+          <w:szCs w:val="32"/>
+          <w:bCs w:val="1"/>
+        </w:rPr>
+        <w:t>عرض الفاتورة في الإصدار ١ ٤ ٤</w:t>
+      </w:r>
+    </w:p>
+    <w:p>
+      <w:pPr>
+        <w:keepNext w:val="0"/>
+        <w:bidi w:val="1"/>
+        <w:jc w:val="start"/>
+      </w:pPr>
+      <w:pPr/>
+      <w:r>
+        <w:rPr>
+          <w:rFonts w:ascii="Tahoma" w:hAnsi="Tahoma" w:eastAsia="Tahoma" w:cs="Tahoma"/>
+          <w:color w:val="000000"/>
+          <w:rtl w:val="1"/>
+          <w:lang w:val="ar-SA" w:eastAsia="ar-SA" w:bidi="ar-SA"/>
+          <w:cs w:val="1"/>
+          <w:szCs w:val="22"/>
+        </w:rPr>
+        <w:t>في القوالب اختر حقول المتجر والعميل والطلب والمنتجات وخاتمة الفاتورة. عند عدم حفظ تفضيل يظهر اسم المتجر وعنوان الشحن فقط. يُخفى اسم العميل ودوره والبريد الإلكتروني وعنوان الفوترة والمتجر وبيانات الاتصال والتواريخ والطرق وتفاصيل المنتجات وتفصيل المبالغ والملاحظات والتذييل. تبقى الاختيارات المحفوظة صراحة سارية. بديل عنوان الفوترة وإظهار المرسل متوقفان عند غياب إعداد سابق. يحل هذا الملحق محل وصف إعدادات العرض الافتراضية السابق.</w:t>
+      </w:r>
+    </w:p>
+    <w:p>
+      <w:pPr>
+        <w:keepNext w:val="0"/>
+        <w:bidi w:val="1"/>
+        <w:jc w:val="start"/>
+      </w:pPr>
+      <w:pPr/>
+      <w:r>
+        <w:rPr>
+          <w:rFonts w:ascii="Tahoma" w:hAnsi="Tahoma" w:eastAsia="Tahoma" w:cs="Tahoma"/>
+          <w:color w:val="000000"/>
+          <w:rtl w:val="1"/>
+          <w:lang w:val="ar-SA" w:eastAsia="ar-SA" w:bidi="ar-SA"/>
+          <w:cs w:val="1"/>
+          <w:szCs w:val="22"/>
+        </w:rPr>
+        <w:t>يستخدم دور العميل الأدوار المترجمة الحالية لحساب WordPress المرتبط؛ الطلب دون حساب مرتبط يعرض ضيفاً. يبقى مرجع الفاتورة وأسماء المنتجات والكميات والمبالغ المستحقة للصفوف والإجمالي النهائي. إخفاء تفصيل المبالغ لا يعيد حساب القيم المحفوظة. تظل الملصقات وقوائم التعبئة دون أسعار. راجع طلباً حقيقياً بعد الترقية.</w:t>
+      </w:r>
+    </w:p>
+    <w:p>
+      <w:pPr>
+        <w:keepNext w:val="0"/>
+        <w:bidi w:val="1"/>
+        <w:jc w:val="start"/>
+      </w:pPr>
+      <w:pPr/>
+      <w:r>
+        <w:rPr>
+          <w:rFonts w:ascii="Tahoma" w:hAnsi="Tahoma" w:eastAsia="Tahoma" w:cs="Tahoma"/>
+          <w:color w:val="000000"/>
+          <w:rtl w:val="1"/>
+          <w:lang w:val="ar-SA" w:eastAsia="ar-SA" w:bidi="ar-SA"/>
+          <w:cs w:val="1"/>
+          <w:szCs w:val="22"/>
+        </w:rPr>
+        <w:t>اختر DejaVu Sans أو DejaVu Serif أو DejaVu Sans Mono وحجماً من ٦ إلى ١٦ نقطة؛ الافتراضي Sans بحجم ١٠. تبقى خطوط PDF البديلة المناسبة للنص. يقلل التخطيط المضغوط المسافات والحشو. التخطيط المضغوط والصفحة الواحدة والارتفاع الحراري متوقفة افتراضياً.</w:t>
+      </w:r>
+    </w:p>
+    <w:p>
+      <w:pPr>
+        <w:keepNext w:val="0"/>
+        <w:bidi w:val="1"/>
+        <w:jc w:val="start"/>
+      </w:pPr>
+      <w:pPr/>
+      <w:r>
+        <w:rPr>
+          <w:rFonts w:ascii="Tahoma" w:hAnsi="Tahoma" w:eastAsia="Tahoma" w:cs="Tahoma"/>
+          <w:color w:val="000000"/>
+          <w:rtl w:val="1"/>
+          <w:lang w:val="ar-SA" w:eastAsia="ar-SA" w:bidi="ar-SA"/>
+          <w:cs w:val="1"/>
+          <w:szCs w:val="22"/>
+        </w:rPr>
+        <w:t>يحافظ احتواء PDF في صفحة واحدة على المحتوى كاملاً بمقياس موحد لا يقل عن ٦٠٪؛ يفشل المحتوى الذي يتجاوز الحد برسالة واضحة دون قص. أخفِ الحقول الاختيارية أو استخدم المسافات المضغوطة أو ورقاً أكبر. يحافظ الارتفاع الحراري على عرض ٥٨ أو ٨٠ مم والخط في صفحة لفافة حتى ٢٠٠٠ مم؛ يفشل المحتوى الأطول. يستخدم المتصفح عارض PDF لهذه الخيارات مع التأكيد خارجه. يظل الورق والمقياس تابعين لبرنامج تشغيل الطابعة.</w:t>
+      </w:r>
+    </w:p>
+    <w:p>
+      <w:pPr>
+        <w:keepNext w:val="0"/>
+        <w:bidi w:val="1"/>
+        <w:jc w:val="start"/>
+      </w:pPr>
+      <w:pPr/>
+      <w:r>
+        <w:rPr>
+          <w:rFonts w:ascii="Tahoma" w:hAnsi="Tahoma" w:eastAsia="Tahoma" w:cs="Tahoma"/>
+          <w:color w:val="000000"/>
+          <w:rtl w:val="1"/>
+          <w:lang w:val="ar-SA" w:eastAsia="ar-SA" w:bidi="ar-SA"/>
+          <w:cs w:val="1"/>
+          <w:szCs w:val="22"/>
+        </w:rPr>
+        <w:t>لا توفر مسارات PDF الحالية أمراً عاماً للقص. اضبط القص في نهاية المستند في برنامج تشغيل يدعمه. تطلب CUPS القيمة job-sheets=none لإلغاء أوراق العنوان الاختيارية؛ قد تضيف سياسة الخادم الإلزامية أوراقاً. إصدار الإضافة ١.٤.٤، ومخطط قاعدة البيانات ١.٤.٣، والصلاحيات ١.٤.٠، وعلامة إيقاف المزود ١.٣.٠.</w:t>
+      </w:r>
+    </w:p>
+    <w:p>
+      <w:pPr>
+        <w:keepNext w:val="0"/>
+        <w:bidi w:val="1"/>
+        <w:jc w:val="start"/>
+      </w:pPr>
+      <w:pPr/>
+      <w:r>
+        <w:rPr>
+          <w:rFonts w:ascii="Tahoma" w:hAnsi="Tahoma" w:eastAsia="Tahoma" w:cs="Tahoma"/>
+          <w:color w:val="000000"/>
+          <w:rtl w:val="1"/>
+          <w:lang w:val="ar-SA" w:eastAsia="ar-SA" w:bidi="ar-SA"/>
+          <w:cs w:val="1"/>
+          <w:szCs w:val="22"/>
+        </w:rPr>
+        <w:t>يجب أن تستخدم القوالب المخصصة مساعدات العرض المرفقة لاحترام الإعدادات. يبقى نموذج البيانات الكامل المصرح به متاحاً؛ العرض ليس تحكماً في الوصول. حافظ على ترميز المخرجات واتجاه RTL والخطوط البديلة واختبر الإخفاء الافتراضي والاختيارات الصريحة والإجمالي واحتواء المحتوى الكامل وفشل الطلبات الطويلة. راجع docs/invoice-layout.md وdocs/review-1.4.4.md.</w:t>
+      </w:r>
+    </w:p>
+    <w:p>
+      <w:pPr>
+        <w:pStyle w:val="Code"/>
+        <w:bidi w:val="0"/>
+      </w:pPr>
+      <w:r>
+        <w:t>InvoiceData-&gt;customer['role']</w:t>
+        <w:br/>
+        <w:t>InvoiceData-&gt;fulfillment['presentation']</w:t>
+        <w:br/>
+        <w:t>SettingsRepository::presentation()</w:t>
+        <w:br/>
+        <w:t>invoice_font: dejavusans | dejavuserif | dejavusansmono</w:t>
+        <w:br/>
+        <w:t>invoice_font_size: 6..16 (default 10)</w:t>
+        <w:br/>
+        <w:t>compact_layout | single_page | thermal_auto_height: false</w:t>
+        <w:br/>
+        <w:t>show_*: individual booleans (flat)</w:t>
+        <w:br/>
+        <w:t>docs/invoice-layout.md</w:t>
+      </w:r>
+    </w:p>
     <w:sectPr>
       <w:headerReference w:type="default" r:id="rId9"/>
       <w:footerReference w:type="default" r:id="rId10"/>
@@ -11149,7 +11310,7 @@
         <w:rtl w:val="0"/>
         <w:lang w:val="en-US" w:eastAsia="ar-SA" w:bidi="ar-SA"/>
       </w:rPr>
-      <w:t>WooCommerce Invoice Printer  1.4.0</w:t>
+      <w:t>WooCommerce Invoice Printer  1.4.4</w:t>
     </w:r>
   </w:p>
 </w:hdr>

</xml_diff>